<commit_message>
fix(docs): 修复 Global Support Advisory 方块字符问题
将所有不受支持的 emoji 和特殊符号替换为等效文本符号：
  ✅ → [OK]   ⚠️ → [!]   💡 → [TIP]
  🌍 → [GLOBAL]  🇨🇳 → [CN]  📋 → [NOTE]
  ↔ → <->    ═/─ → =/- (box-drawing chars)

保留的字符均在 Arial 字体中完整支持：
  — (em dash)  · (middle dot)  á ã (Latin accented)
</commit_message>
<xml_diff>
--- a/docs/GeoClaw_Global_Support_Advisory_v3.0.0.docx
+++ b/docs/GeoClaw_Global_Support_Advisory_v3.0.0.docx
@@ -252,7 +252,7 @@
                 <w:sz w:val="22"/>
                 <w:szCs w:val="22"/>
               </w:rPr>
-              <w:t xml:space="preserve">✅  </w:t>
+              <w:t xml:space="preserve">[OK]  </w:t>
             </w:r>
             <w:r>
               <w:rPr>
@@ -1602,7 +1602,7 @@
                 <w:sz w:val="19"/>
                 <w:szCs w:val="19"/>
               </w:rPr>
-              <w:t xml:space="preserve">✅ Excellent</w:t>
+              <w:t xml:space="preserve">[OK] Excellent</w:t>
             </w:r>
           </w:p>
         </w:tc>
@@ -1696,7 +1696,7 @@
                 <w:sz w:val="19"/>
                 <w:szCs w:val="19"/>
               </w:rPr>
-              <w:t xml:space="preserve">✅ Excellent</w:t>
+              <w:t xml:space="preserve">[OK] Excellent</w:t>
             </w:r>
           </w:p>
         </w:tc>
@@ -1790,7 +1790,7 @@
                 <w:sz w:val="19"/>
                 <w:szCs w:val="19"/>
               </w:rPr>
-              <w:t xml:space="preserve">✅ Excellent</w:t>
+              <w:t xml:space="preserve">[OK] Excellent</w:t>
             </w:r>
           </w:p>
         </w:tc>
@@ -1884,7 +1884,7 @@
                 <w:sz w:val="19"/>
                 <w:szCs w:val="19"/>
               </w:rPr>
-              <w:t xml:space="preserve">✅ Good</w:t>
+              <w:t xml:space="preserve">[OK] Good</w:t>
             </w:r>
           </w:p>
         </w:tc>
@@ -1978,7 +1978,7 @@
                 <w:sz w:val="19"/>
                 <w:szCs w:val="19"/>
               </w:rPr>
-              <w:t xml:space="preserve">✅ Excellent</w:t>
+              <w:t xml:space="preserve">[OK] Excellent</w:t>
             </w:r>
           </w:p>
         </w:tc>
@@ -2072,7 +2072,7 @@
                 <w:sz w:val="19"/>
                 <w:szCs w:val="19"/>
               </w:rPr>
-              <w:t xml:space="preserve">✅ Good</w:t>
+              <w:t xml:space="preserve">[OK] Good</w:t>
             </w:r>
           </w:p>
         </w:tc>
@@ -2166,7 +2166,7 @@
                 <w:sz w:val="19"/>
                 <w:szCs w:val="19"/>
               </w:rPr>
-              <w:t xml:space="preserve">⚠️ Moderate</w:t>
+              <w:t xml:space="preserve">[!] Moderate</w:t>
             </w:r>
           </w:p>
         </w:tc>
@@ -2260,7 +2260,7 @@
                 <w:sz w:val="19"/>
                 <w:szCs w:val="19"/>
               </w:rPr>
-              <w:t xml:space="preserve">⚠️ Moderate</w:t>
+              <w:t xml:space="preserve">[!] Moderate</w:t>
             </w:r>
           </w:p>
         </w:tc>
@@ -2354,7 +2354,7 @@
                 <w:sz w:val="19"/>
                 <w:szCs w:val="19"/>
               </w:rPr>
-              <w:t xml:space="preserve">⚠️ Variable</w:t>
+              <w:t xml:space="preserve">[!] Variable</w:t>
             </w:r>
           </w:p>
         </w:tc>
@@ -2448,7 +2448,7 @@
                 <w:sz w:val="19"/>
                 <w:szCs w:val="19"/>
               </w:rPr>
-              <w:t xml:space="preserve">⚠️ Variable</w:t>
+              <w:t xml:space="preserve">[!] Variable</w:t>
             </w:r>
           </w:p>
         </w:tc>
@@ -2542,7 +2542,7 @@
                 <w:sz w:val="19"/>
                 <w:szCs w:val="19"/>
               </w:rPr>
-              <w:t xml:space="preserve">⚠️ Variable</w:t>
+              <w:t xml:space="preserve">[!] Variable</w:t>
             </w:r>
           </w:p>
         </w:tc>
@@ -2628,7 +2628,7 @@
                 <w:sz w:val="22"/>
                 <w:szCs w:val="22"/>
               </w:rPr>
-              <w:t xml:space="preserve">💡  </w:t>
+              <w:t xml:space="preserve">[TIP]  </w:t>
             </w:r>
             <w:r>
               <w:rPr>
@@ -3193,7 +3193,7 @@
                 <w:sz w:val="22"/>
                 <w:szCs w:val="22"/>
               </w:rPr>
-              <w:t xml:space="preserve">⚠️  </w:t>
+              <w:t xml:space="preserve">[!]  </w:t>
             </w:r>
             <w:r>
               <w:rPr>
@@ -5482,7 +5482,7 @@
                 <w:sz w:val="19"/>
                 <w:szCs w:val="19"/>
               </w:rPr>
-              <w:t xml:space="preserve">🌍 Fully global — no geographic restrictions</w:t>
+              <w:t xml:space="preserve">Fully global — no geographic restrictions</w:t>
             </w:r>
           </w:p>
         </w:tc>
@@ -5546,7 +5546,7 @@
                 <w:sz w:val="19"/>
                 <w:szCs w:val="19"/>
               </w:rPr>
-              <w:t xml:space="preserve">🌍 Fully global — Chinese and English optimized; other languages via LLM backend</w:t>
+              <w:t xml:space="preserve">Fully global — Chinese and English optimized; other languages via LLM backend</w:t>
             </w:r>
           </w:p>
         </w:tc>
@@ -5610,7 +5610,7 @@
                 <w:sz w:val="19"/>
                 <w:szCs w:val="19"/>
               </w:rPr>
-              <w:t xml:space="preserve">🌍 Fully global — no geographic logic in reasoning pipeline</w:t>
+              <w:t xml:space="preserve">Fully global — no geographic logic in reasoning pipeline</w:t>
             </w:r>
           </w:p>
         </w:tc>
@@ -5674,7 +5674,7 @@
                 <w:sz w:val="19"/>
                 <w:szCs w:val="19"/>
               </w:rPr>
-              <w:t xml:space="preserve">🌍 Fully global — user-defined modules run anywhere</w:t>
+              <w:t xml:space="preserve">Fully global — user-defined modules run anywhere</w:t>
             </w:r>
           </w:p>
         </w:tc>
@@ -5738,9 +5738,9 @@
                 <w:sz w:val="19"/>
                 <w:szCs w:val="19"/>
               </w:rPr>
-              <w:t xml:space="preserve">✅ Excellent: W. Europe, N. America, Japan, Singapore, Australia
-⚠️ Good: SE Asia, Latin America major cities
-⚠️ Variable: S. Asia, MENA, Africa, China</w:t>
+              <w:t xml:space="preserve">[OK] Excellent: W. Europe, N. America, Japan, Singapore, Australia
+[!] Good: SE Asia, Latin America major cities
+[!] Variable: S. Asia, MENA, Africa, China</w:t>
             </w:r>
           </w:p>
         </w:tc>
@@ -5804,8 +5804,8 @@
                 <w:sz w:val="19"/>
                 <w:szCs w:val="19"/>
               </w:rPr>
-              <w:t xml:space="preserve">🇨🇳 China-specific (WGS-84 ↔ GCJ-02 ↔ BD-09);
-🌍 WGS-84 standard used globally by default</w:t>
+              <w:t xml:space="preserve">[CN] China-specific (WGS-84 &lt;-&gt; GCJ-02 &lt;-&gt; BD-09);
+[GLOBAL] WGS-84 standard used globally by default</w:t>
             </w:r>
           </w:p>
         </w:tc>
@@ -5869,7 +5869,7 @@
                 <w:sz w:val="19"/>
                 <w:szCs w:val="19"/>
               </w:rPr>
-              <w:t xml:space="preserve">🇨🇳 Wuhan only (v3.0.0); global city demos planned</w:t>
+              <w:t xml:space="preserve">[CN] Wuhan only (v3.0.0); global city demos planned</w:t>
             </w:r>
           </w:p>
         </w:tc>
@@ -5933,7 +5933,7 @@
                 <w:sz w:val="19"/>
                 <w:szCs w:val="19"/>
               </w:rPr>
-              <w:t xml:space="preserve">🇨🇳 China only; international equivalents recommended (see Section 6)</w:t>
+              <w:t xml:space="preserve">[CN] China only; international equivalents recommended (see Section 6)</w:t>
             </w:r>
           </w:p>
         </w:tc>
@@ -5990,7 +5990,7 @@
                 <w:sz w:val="22"/>
                 <w:szCs w:val="22"/>
               </w:rPr>
-              <w:t xml:space="preserve">📋  </w:t>
+              <w:t xml:space="preserve">[NOTE]  </w:t>
             </w:r>
             <w:r>
               <w:rPr>

</xml_diff>